<commit_message>
Revise ISMRM abstract and add distillation and narrow-band controls
Abstract: new Impact and Introduction, phantom features and noise level in
Methods, fitter-uncertainty arm dropped from text and Fig 5, discussion of
why one schedule suits most scans, and cuts to fit 750 words.

Controls: distil the no-memory and sigma policies into fixed protocols, and
evaluate the TI-histogram policy on narrow-band phantoms through a new
:narrow_band T1 sampler in e2.jl (own centre stream, default samplers
unchanged, with tests). Shared replay code moved to fixed_schedules.jl.
test_materials.jl synced to the corrected T2 tables.
</commit_message>
<xml_diff>
--- a/ismrm_latex/vancouver/ISMRM2027_abstract_draft.docx
+++ b/ismrm_latex/vancouver/ISMRM2027_abstract_draft.docx
@@ -7,7 +7,7 @@
         <w:pStyle w:val="Title"/>
       </w:pPr>
       <w:r>
-        <w:t xml:space="preserve">Reinforcement learning in a digital twin of the ISMRM/NIST phantom discovers more accurate T1 mapping protocols</w:t>
+        <w:t xml:space="preserve">Reinforcement learning using a digital twin of the ISMRM/NIST phantom discovers more accurate T1 mapping protocols</w:t>
       </w:r>
     </w:p>
     <w:p>
@@ -24,7 +24,7 @@
         <w:spacing w:after="120"/>
       </w:pPr>
       <w:r>
-        <w:t xml:space="preserve">Arthur Allilaire (1), Magali [surname TBC] (2), Wayne Luk (1), Andreas Wetscherek (2).</w:t>
+        <w:t xml:space="preserve">Arthur Allilaire (1), Magali Nuixe (2), Wayne Luk (1), Andreas Wetscherek (2).</w:t>
       </w:r>
     </w:p>
     <w:p>
@@ -134,7 +134,7 @@
         <w:spacing w:after="120"/>
       </w:pPr>
       <w:r>
-        <w:t xml:space="preserve">An open-source digital twin lets reinforcement learning design quantitative MRI protocols in simulation. The protocol it found halves T1 error against established fixed designs and, distilled into a fixed sequence, could run on scanners without learning at scan time.</w:t>
+        <w:t xml:space="preserve">An open-source, KomaMRI-based digital twin of the ISMRM/NIST phantom lets reinforcement learning design quantitative MRI protocols before scanning. Learned sequences halved T1 error versus standard designs. Adapting during the scan could protect accuracy for atypical tissue.</w:t>
       </w:r>
     </w:p>
     <w:p>
@@ -203,7 +203,7 @@
         <w:t xml:space="preserve">Results:</w:t>
       </w:r>
       <w:r>
-        <w:t xml:space="preserve"> On held-out phantoms the policy halved T1 error against log-spaced and Cramér-Rao-optimal schedules (2.9% versus 6.0% and 7.7%); a fixed protocol distilled from it kept most of the gain (3.3%).</w:t>
+        <w:t xml:space="preserve"> On held-out phantoms the policy halved T1 error against log-spaced and Cramér-Rao-optimal schedules (2.9% versus 6.0% and 7.7%). A fixed protocol distilled from the adaptive policy kept most of the gain (3.3%).</w:t>
       </w:r>
     </w:p>
     <w:p>
@@ -229,7 +229,7 @@
         <w:spacing w:after="120"/>
       </w:pPr>
       <w:r>
-        <w:t xml:space="preserve">T1 mapping protocols fix their inversion times (TIs) in advance to stay informative for every plausible tissue. Adaptive acquisition instead chooses each timing from the running estimate; simulations report 1.7-4x acceleration for a single voxel and tissue</w:t>
+        <w:t xml:space="preserve">The best inversion times (TIs) depend on the T1 being measured, so fixed T1 mapping protocols hedge across all plausible tissues. Instead, adaptive acquisition chooses each timing from the running estimate; simulations report 1.7-4x acceleration for a single voxel</w:t>
       </w:r>
       <w:r>
         <w:rPr>
@@ -238,7 +238,7 @@
         <w:t xml:space="preserve">1</w:t>
       </w:r>
       <w:r>
-        <w:t xml:space="preserve">. Reinforcement learning (RL) could learn such rules from Bloch simulation, for several tissues and including reconstruction, but RL in MRI has so far optimised fixed protocols offline</w:t>
+        <w:t xml:space="preserve">. Reinforcement learning (RL) could learn such rules for several tissues at once, but in MRI it has so far designed fixed protocols before scanning</w:t>
       </w:r>
       <w:r>
         <w:rPr>
@@ -247,7 +247,7 @@
         <w:t xml:space="preserve">2,3</w:t>
       </w:r>
       <w:r>
-        <w:t xml:space="preserve"> or image-level goals</w:t>
+        <w:t xml:space="preserve"> or adapted acquisition for image reconstruction (using k-space sampling) or shape recognition</w:t>
       </w:r>
       <w:r>
         <w:rPr>
@@ -256,7 +256,7 @@
         <w:t xml:space="preserve">4,5</w:t>
       </w:r>
       <w:r>
-        <w:t xml:space="preserve">. This needs a cheap simulator with known ground truth. We built an open-source digital twin of a calibration phantom, trained RL policies that choose each TI and repetition time (TR) from the data so far, and asked where their benefit comes from.</w:t>
+        <w:t xml:space="preserve">. We built an open-source digital twin of a calibration phantom and trained the first RL agent to choose each TI and repetition time (TR) from the tissue estimates it is refining.</w:t>
       </w:r>
     </w:p>
     <w:p>
@@ -289,7 +289,7 @@
         <w:t xml:space="preserve">6</w:t>
       </w:r>
       <w:r>
-        <w:t xml:space="preserve"> (CaliberMRI QalibreMD Model 130) with its T1, T2 and proton-density plates and manufacturer reference values at 1.5 and 3 T, and returns KomaMRI</w:t>
+        <w:t xml:space="preserve"> with its T1, T2 and proton-density plates and manufacturer reference values at 1.5 and 3 T, and returns KomaMRI</w:t>
       </w:r>
       <w:r>
         <w:rPr>
@@ -298,7 +298,7 @@
         <w:t xml:space="preserve">7</w:t>
       </w:r>
       <w:r>
-        <w:t xml:space="preserve"> phantoms (Fig 1A). It samples random phantoms with hidden ground truth (Fig 1B) and provides 2D inversion-recovery spin-echo (IR-SE) sequences, reconstruction, a T1 fitter modelling incomplete recovery, and a Cramér-Rao schedule solver. Noise-free simulations recover reference T1 with 0.48% mean error.</w:t>
+        <w:t xml:space="preserve"> phantoms (Fig 1A). It samples random phantoms with hidden ground truth (pose, sphere subsets, and T1 and T2 from user-set distributions; Fig 1B), adds complex Gaussian k-space noise, and provides 2D inversion-recovery spin-echo (IR-SE) sequences, reconstruction, a T1 fitter modelling incomplete recovery, and a Cramér-Rao schedule solver. Noise-free simulations recover reference T1 with 0.48% mean error.</w:t>
       </w:r>
     </w:p>
     <w:p>
@@ -313,7 +313,7 @@
         <w:t xml:space="preserve">Task.</w:t>
       </w:r>
       <w:r>
-        <w:t xml:space="preserve"> Each scan draws five T1-plate sphere T1s uniformly over 0.024-1.88 s (other positions water) and jitters the pose; 1.5 T, 64x32 matrix, 200 mm field of view, complex Gaussian k-space noise. Each action is one IR-SE block of 32 phase-encode shots with TI 0.01-3 s and TR 0.5-5 s (TE 20 ms, 90°); scans stop at 560 s. T1 is refitted per sphere after every block.</w:t>
+        <w:t xml:space="preserve"> Each scan draws five T1-plate sphere T1s uniformly over 0.024-1.88 s and jitters the pose; 1.5 T, 64x32 matrix, 200 mm field of view, noise at NEMA dual-acquisition SNR 25 (brightest sphere). Each action is one IR-SE block of 32 phase-encode shots with TI 0.01-3 s and TR 0.5-5 s (TE 20 ms, 90°); scans stop at 560 s. T1 is refitted per sphere after every block.</w:t>
       </w:r>
     </w:p>
     <w:p>
@@ -337,7 +337,7 @@
         <w:t xml:space="preserve">8</w:t>
       </w:r>
       <w:r>
-        <w:t xml:space="preserve"> policy observes the log T1 estimates, budget used and a 12-bin histogram of acquired TIs; the reward is the per-block drop in log mean absolute percentage error (MAPE) (Fig 2A). Alternatives: no memory, the fitter's uncertainty, or an LSTM.</w:t>
+        <w:t xml:space="preserve"> policy observes the log T1 estimates, budget used and a 12-bin histogram of acquired TIs; the reward is the per-block drop in log mean absolute percentage error (MAPE) (Fig 2A). Alternatives: no memory or an LSTM.</w:t>
       </w:r>
     </w:p>
     <w:p>
@@ -367,7 +367,7 @@
         <w:t xml:space="preserve">Evaluation.</w:t>
       </w:r>
       <w:r>
-        <w:t xml:space="preserve"> Twenty-four held-out phantoms, never used for training or checkpoint selection, were shared by all methods. Comparators were a log-spaced TI grid (TR 1.7 s) and a Cramér-Rao-optimal (TI, TR) schedule</w:t>
+        <w:t xml:space="preserve"> All methods shared 24 held-out phantoms unseen in training or checkpoint selection. Comparators were a log-spaced TI grid (TR 1.7 s) and a Cramér-Rao-optimal (TI, TR) schedule</w:t>
       </w:r>
       <w:r>
         <w:rPr>
@@ -393,7 +393,7 @@
         <w:spacing w:after="120"/>
       </w:pPr>
       <w:r>
-        <w:t xml:space="preserve">Training moved the policy from few long-TR blocks to short TIs paired with short TRs, acquiring about 13 blocks per scan instead of 7 (Fig 3A-C); scans share a two-block opening, then diverge (Fig 3D). On held-out phantoms the TI-histogram policy reached 2.93% MAPE [95% CI 2.58-3.30], against 6.04% [5.36-6.70] for the log grid and 7.74% [7.08-8.42] for Cramér-Rao, with 96% versus 25% and 8% of scans below 5% error (Figs 4, 5). Memory mattered: 4.16% without it, 5.25% with the fitter's uncertainty, 7.31% with an LSTM. Tripling the grid's scan time (163 to 504 s) reduced its error only from 6.86% to 6.04%. Most of the gain survived without adaptation: the distilled protocol reached 3.34% [2.30-4.86] and swapped schedules 3.61% [3.01-4.45]. Adaptation showed in the worst case (5.1% versus 10.3-17.9% for the fixed schedules): the policy's shortest TI tracked the phantom's shortest T1 (r = 0.57), rescuing two spheres of 41 and 46 ms that the distilled protocol missed by up to 74%.</w:t>
+        <w:t xml:space="preserve">Training moved the policy from few long-TR blocks to short TIs paired with short TRs (Fig 3A-C); scans share a two-block opening, then diverge (Fig 3D). On held-out phantoms the TI-histogram policy reached 2.93% MAPE [95% CI 2.58-3.30], against 6.04% [5.36-6.70] for the log grid and 7.74% [7.08-8.42] for Cramér-Rao, with 96% versus 25% and 8% of scans below 5% error (Figs 4, 5). Without memory the policy reached 4.16%; with an LSTM, 7.31%. Tripling the grid's scan time (163 to 504 s) reduced its error only from 6.86% to 6.04%. Most of the gain survived without adaptation: the distilled protocol reached 3.34% [2.30-4.86] and swapped schedules 3.61% [3.01-4.45]. Adaptation showed in the worst case (5.1% versus 10.3-17.9% for the fixed schedules): the policy's shortest TI tracked the phantom's shortest T1 (r = 0.57), rescuing two spheres of 41 and 46 ms that the distilled protocol missed by up to 74%.</w:t>
       </w:r>
     </w:p>
     <w:p>
@@ -410,7 +410,7 @@
         <w:spacing w:after="120"/>
       </w:pPr>
       <w:r>
-        <w:t xml:space="preserve">Closed-loop RL worked mainly as protocol discovery: the learned schedule acquires more blocks than either comparator (12.5 versus 9-10) by keeping TR short unless TI is long. The Cramér-Rao schedule, optimal for an unbiased estimator's variance, did worst at this noise level and block count. Whether memory mainly steers training towards better schedules is untested; the LSTM checkpoint predated full-Bloch training. Per-scan adaptation added robustness for unusual tissue, not mean accuracy. Limitations: simulation only (ideal RF, no B1, eddy currents or motion), one phantom, five spheres, one seed per arm, 24 held-out scans; the two-sphere effect is post hoc.</w:t>
+        <w:t xml:space="preserve">Closed-loop RL worked mainly as protocol discovery: the learned schedule acquires more blocks than either comparator (12.5 versus 9-10) by keeping TR short unless TI is long. The Cramér-Rao schedule, optimal for an unbiased estimator's variance, did worst at this noise level and block count. Because each scan's five spheres usually spanned most of the T1 range, one schedule suited most scans; per-scan adaptation paid off only for rare outliers, adding robustness rather than mean accuracy. Limitations: simulation only (ideal RF, no B1, eddy currents or motion), one phantom, five spheres, one seed per arm, 24 held-out scans; the two-sphere effect is post hoc.</w:t>
       </w:r>
     </w:p>
     <w:p>
@@ -768,7 +768,7 @@
         <w:t xml:space="preserve">Figure 3. </w:t>
       </w:r>
       <w:r>
-        <w:t xml:space="preserve">TI-histogram policy over training, 24 validation phantoms unless stated. (A) T1 MAPE of every saved checkpoint, full Bloch (mean, bootstrap 95% CI); faint: logged probes; star and lines: selected checkpoint and fixed protocols, 24 held-out phantoms. Colour: checkpoints followed in B and C. (B) Executed (TI, TR): pairing short TIs with short TRs fits 13 blocks, not 7. (C) T1 MAPE within a scan (median, IQR). (D) Selected policy's TI per block, coloured by mean sphere T1; inset: one IR-SE shot.</w:t>
+        <w:t xml:space="preserve">TI-histogram policy over training, 24 validation phantoms unless stated. (A) T1 MAPE of every saved checkpoint, full Bloch (mean, bootstrap 95% CI); faint: logged probes; star and lines: selected checkpoint and fixed protocols, 24 held-out phantoms. Coloured: checkpoints followed in B and C. (B) Executed (TI, TR): pairing short TIs with short TRs fits 13 blocks, not 7. (C) T1 MAPE within a scan (median, IQR). (D) Selected policy's TI per block, coloured by mean sphere T1; inset: one IR-SE shot.</w:t>
       </w:r>
     </w:p>
     <w:p>
@@ -781,7 +781,7 @@
           <w:sz w:val="18"/>
           <w:szCs w:val="18"/>
         </w:rPr>
-        <w:t xml:space="preserve">Caption: 497/500 characters</w:t>
+        <w:t xml:space="preserve">Caption: 499/500 characters</w:t>
       </w:r>
     </w:p>
     <w:p>
@@ -887,7 +887,7 @@
       <w:r>
         <w:drawing>
           <wp:inline distT="0" distB="0" distL="0" distR="0">
-            <wp:extent cx="5715000" cy="2305050"/>
+            <wp:extent cx="5715000" cy="2286000"/>
             <wp:effectExtent t="0" r="0" b="0" l="0"/>
             <wp:docPr id="5" name=""/>
             <wp:cNvGraphicFramePr>
@@ -912,7 +912,7 @@
                   <pic:spPr bwMode="auto">
                     <a:xfrm>
                       <a:off x="0" y="0"/>
-                      <a:ext cx="5715000" cy="2305050"/>
+                      <a:ext cx="5715000" cy="2286000"/>
                     </a:xfrm>
                     <a:prstGeom prst="rect">
                       <a:avLst/>
@@ -1045,6 +1045,15 @@
     </w:p>
     <w:p>
       <w:pPr>
+        <w:pStyle w:val="Heading1"/>
+        <w:keepNext/>
+      </w:pPr>
+      <w:r>
+        <w:t xml:space="preserve">Notes for co-authors (remove before submission)</w:t>
+      </w:r>
+    </w:p>
+    <w:p>
+      <w:pPr>
         <w:pStyle w:val="ListParagraph"/>
         <w:numPr>
           <w:ilvl w:val="0"/>
@@ -1052,16 +1061,7 @@
         </w:numPr>
       </w:pPr>
       <w:r>
-        <w:t xml:space="preserve">Funding: TBC.</w:t>
-      </w:r>
-    </w:p>
-    <w:p>
-      <w:pPr>
-        <w:pStyle w:val="Heading1"/>
-        <w:keepNext/>
-      </w:pPr>
-      <w:r>
-        <w:t xml:space="preserve">Notes for co-authors (remove before submission)</w:t>
+        <w:t xml:space="preserve">Title 114/125 characters; impact 36/40 words; synopsis 99/100 words; body 742/750 words including section headings.</w:t>
       </w:r>
     </w:p>
     <w:p>
@@ -1073,7 +1073,7 @@
         </w:numPr>
       </w:pPr>
       <w:r>
-        <w:t xml:space="preserve">Title 111/125 characters; impact 39/40 words; synopsis 97/100 words; body 747/750 words including section headings.</w:t>
+        <w:t xml:space="preserve">Captions: Figure 1 491, Figure 2 494, Figure 3 499, Figure 4 482, Figure 5 497 (max 500 characters each).</w:t>
       </w:r>
     </w:p>
     <w:p>
@@ -1085,7 +1085,7 @@
         </w:numPr>
       </w:pPr>
       <w:r>
-        <w:t xml:space="preserve">Captions: Figure 1 491, Figure 2 494, Figure 3 497, Figure 4 482, Figure 5 497 (max 500 characters each).</w:t>
+        <w:t xml:space="preserve">☐ Merge https://github.com/ArthurAllilaire/MRISystemPhantom.jl/pull/1 (T2-plate T2 values corrected to the manual; all 1140 tests pass), since the body claims the manufacturer's reference values.</w:t>
       </w:r>
     </w:p>
     <w:p>
@@ -1097,7 +1097,7 @@
         </w:numPr>
       </w:pPr>
       <w:r>
-        <w:t xml:space="preserve">☐ Merge https://github.com/ArthurAllilaire/MRISystemPhantom.jl/pull/1 (T2-plate T2 values corrected to the manual; all 1140 tests pass), since the body claims the manufacturer's reference values.</w:t>
+        <w:t xml:space="preserve">☐ Confirm Magali Nuixe's affiliation (listed as ICR, affiliation 2); co-author approval from all four authors.</w:t>
       </w:r>
     </w:p>
     <w:p>
@@ -1109,31 +1109,7 @@
         </w:numPr>
       </w:pPr>
       <w:r>
-        <w:t xml:space="preserve">☐ Magali's surname and affiliation; co-author approval from all four authors.</w:t>
-      </w:r>
-    </w:p>
-    <w:p>
-      <w:pPr>
-        <w:pStyle w:val="ListParagraph"/>
-        <w:numPr>
-          <w:ilvl w:val="0"/>
-          <w:numId w:val="2"/>
-        </w:numPr>
-      </w:pPr>
-      <w:r>
         <w:t xml:space="preserve">☐ Reference 9 is a T2 sampling paper; replace with a T1 inversion-recovery Cramér-Rao design reference if one fits better.</w:t>
-      </w:r>
-    </w:p>
-    <w:p>
-      <w:pPr>
-        <w:pStyle w:val="ListParagraph"/>
-        <w:numPr>
-          <w:ilvl w:val="0"/>
-          <w:numId w:val="2"/>
-        </w:numPr>
-      </w:pPr>
-      <w:r>
-        <w:t xml:space="preserve">☐ Funding line.</w:t>
       </w:r>
     </w:p>
     <w:p>

</xml_diff>

<commit_message>
Revise ISMRM abstract text and adopt new Figures 1, 3 and 5
Text: rewritten Introduction, Methods (twin features, task, reward equation,
multi-fidelity on GPU, evaluation with clustered-T1 phantoms), Results and
Discussion, trimmed to 746 words; Look-Locker and MRF references added.

Figures: Fig 1 adds a generic IR-SE shot panel and compacts the training
slabs; Fig 3 superposes the TI-TR checkpoints, adds fixed comparators to the
within-scan MAPE panel and splits panel D into spread vs clustered-T1 scans;
Fig 5 becomes two panels (held-out and clustered-T1) with a reworded LSTM
footnote. Previous figure versions still regenerate unchanged.
</commit_message>
<xml_diff>
--- a/ismrm_latex/vancouver/ISMRM2027_abstract_draft.docx
+++ b/ismrm_latex/vancouver/ISMRM2027_abstract_draft.docx
@@ -7,7 +7,7 @@
         <w:pStyle w:val="Title"/>
       </w:pPr>
       <w:r>
-        <w:t xml:space="preserve">Reinforcement learning using a digital twin of the ISMRM/NIST phantom discovers more accurate T1 mapping protocols</w:t>
+        <w:t xml:space="preserve">Reinforcement learning using a digital twin of the ISMRM/NIST phantom learns more accurate T1 mapping protocols</w:t>
       </w:r>
     </w:p>
     <w:p>
@@ -134,7 +134,7 @@
         <w:spacing w:after="120"/>
       </w:pPr>
       <w:r>
-        <w:t xml:space="preserve">An open-source, KomaMRI-based digital twin of the ISMRM/NIST phantom lets reinforcement learning design quantitative MRI protocols before scanning. Learned sequences halved T1 error versus standard designs. Adapting during the scan could protect accuracy for atypical tissue.</w:t>
+        <w:t xml:space="preserve">An open-source, KomaMRI-based digital twin of a calibration phantom lets reinforcement learning design quantitative MRI protocols before scanning. Learned sequences halved T1 error versus standard designs. Adapting mid-scan helps most when tissue T1 is a narrow range.</w:t>
       </w:r>
     </w:p>
     <w:p>
@@ -188,7 +188,7 @@
         <w:t xml:space="preserve">Approach:</w:t>
       </w:r>
       <w:r>
-        <w:t xml:space="preserve"> We built an open-source Bloch-simulated twin of the ISMRM/NIST phantom with multi-fidelity forward models and trained policies that choose each inversion and repetition time from the data acquired so far.</w:t>
+        <w:t xml:space="preserve"> We built an open-source Bloch-simulated twin of the phantom with multi-fidelity forward models and trained policies that choose each inversion and repetition time from the data acquired so far.</w:t>
       </w:r>
     </w:p>
     <w:p>
@@ -289,7 +289,7 @@
         <w:t xml:space="preserve">6</w:t>
       </w:r>
       <w:r>
-        <w:t xml:space="preserve"> with its T1, T2 and proton-density plates and manufacturer reference values at 1.5 and 3 T, and returns KomaMRI</w:t>
+        <w:t xml:space="preserve"> with manufacturer reference values at 1.5 and 3 T and returns KomaMRI</w:t>
       </w:r>
       <w:r>
         <w:rPr>
@@ -298,7 +298,7 @@
         <w:t xml:space="preserve">7</w:t>
       </w:r>
       <w:r>
-        <w:t xml:space="preserve"> phantoms (Fig 1A). It samples random phantoms with hidden ground truth (pose, sphere subsets, and T1 and T2 from user-set distributions; Fig 1B), adds complex Gaussian k-space noise, and provides 2D inversion-recovery spin-echo (IR-SE) sequences, reconstruction, a T1 fitter modelling incomplete recovery, and a Cramér-Rao schedule solver. Noise-free simulations recover reference T1 with 0.48% mean error.</w:t>
+        <w:t xml:space="preserve"> phantoms (Fig 1A). Random phantoms with hidden ground truth vary pose, sphere selection, and T1 and T2 from any chosen distribution (Fig 1B). The package also provides inversion-recovery spin-echo (IR-SE) sequences (Fig 1C), complex Gaussian k-space noise, a T1 fitter modelling incomplete recovery and a Cramér-Rao schedule solver. Noise-free simulations recover reference T1 with 0.48% mean error.</w:t>
       </w:r>
     </w:p>
     <w:p>
@@ -313,7 +313,7 @@
         <w:t xml:space="preserve">Task.</w:t>
       </w:r>
       <w:r>
-        <w:t xml:space="preserve"> Each scan draws five T1-plate sphere T1s uniformly over 0.024-1.88 s and jitters the pose; 1.5 T, 64x32 matrix, 200 mm field of view, noise at NEMA dual-acquisition SNR 25 (brightest sphere). Each action is one IR-SE block of 32 phase-encode shots with TI 0.01-3 s and TR 0.5-5 s (TE 20 ms, 90°); scans stop at 560 s. T1 is refitted per sphere after every block.</w:t>
+        <w:t xml:space="preserve"> Each scan fills five T1-plate spheres with T1s drawn uniformly over the plate's T1 range (Fig 1B); 1.5 T, 64x32 matrix, 200 mm field of view, noise at peak NEMA SNR 25. Each action is one IR-SE block (Fig 1C); scans stop at 560 s.</w:t>
       </w:r>
     </w:p>
     <w:p>
@@ -337,7 +337,7 @@
         <w:t xml:space="preserve">8</w:t>
       </w:r>
       <w:r>
-        <w:t xml:space="preserve"> policy observes the log T1 estimates, budget used and a 12-bin histogram of acquired TIs; the reward is the per-block drop in log mean absolute percentage error (MAPE) (Fig 2A). Alternatives: no memory or an LSTM.</w:t>
+        <w:t xml:space="preserve"> policy observes the log T1 estimates, budget used and a 12-bin histogram of acquired TIs; its reward is $r_t=\log_{10}\mathrm{MAPE}_{t-1}-\log_{10}\mathrm{MAPE}_t$, with MAPE the mean absolute percentage error (Fig 2A). Ablations tried: no memory &amp; an LSTM.</w:t>
       </w:r>
     </w:p>
     <w:p>
@@ -352,7 +352,7 @@
         <w:t xml:space="preserve">Multi-fidelity training.</w:t>
       </w:r>
       <w:r>
-        <w:t xml:space="preserve"> Full Bloch simulation costs about 1 s per block. Because simulation is linear in spins and the water homogeneous, the water's k-space is a per-shot scalar times a fixed template; caching it leaves only sphere spins to simulate (T1 within 0.12% of full Bloch). One policy climbs from an analytic model through cached and coarse water to full Bloch (Fig 1C), promoted on full-Bloch probes (Fig 2B); 9 h on one GPU per arm.</w:t>
+        <w:t xml:space="preserve"> Full Bloch simulation costs about 0.1 s per block on our GPU, and each policy trains for ~300,000 blocks. The water is homogeneous, so its k-space can be cached and scaled per shot, leaving only the sphere spins we measure to simulate (T1 within 0.12% of full Bloch). One policy climbs a fidelity ladder from an analytic model to full Bloch (Fig 1D), warm-starting on cheap rungs before full-Bloch training (Figs 2B, 3A); 9 GPU hours per policy.</w:t>
       </w:r>
     </w:p>
     <w:p>
@@ -367,7 +367,7 @@
         <w:t xml:space="preserve">Evaluation.</w:t>
       </w:r>
       <w:r>
-        <w:t xml:space="preserve"> All methods shared 24 held-out phantoms unseen in training or checkpoint selection. Comparators were a log-spaced TI grid (TR 1.7 s) and a Cramér-Rao-optimal (TI, TR) schedule</w:t>
+        <w:t xml:space="preserve"> We tested on 24 held-out phantoms from the training distribution and on 96 clustered-T1 phantoms from a new distribution: five T1s within ±15% of a log-uniform centre. Fixed comparators were a log-spaced TI grid (TR 1.7 s) and a Cramér-Rao-optimal (TI, TR) schedule</w:t>
       </w:r>
       <w:r>
         <w:rPr>
@@ -376,7 +376,7 @@
         <w:t xml:space="preserve">9</w:t>
       </w:r>
       <w:r>
-        <w:t xml:space="preserve"> for the plate's T1 range, with the same fitter and budget. To separate adaptation from schedule shape, we gave each phantom another scan's learned schedule, and distilled one fixed protocol from the per-block median TI and TR of the policy's validation schedules.</w:t>
+        <w:t xml:space="preserve"> for the plate's T1 range, with the same fitter and budget. To separate adaptation from schedule shape, we swapped learned schedules between scans and distilled one fixed protocol from the policy's median TI and TR at each block on validation scans.</w:t>
       </w:r>
     </w:p>
     <w:p>
@@ -393,7 +393,7 @@
         <w:spacing w:after="120"/>
       </w:pPr>
       <w:r>
-        <w:t xml:space="preserve">Training moved the policy from few long-TR blocks to short TIs paired with short TRs (Fig 3A-C); scans share a two-block opening, then diverge (Fig 3D). On held-out phantoms the TI-histogram policy reached 2.93% MAPE [95% CI 2.58-3.30], against 6.04% [5.36-6.70] for the log grid and 7.74% [7.08-8.42] for Cramér-Rao, with 96% versus 25% and 8% of scans below 5% error (Figs 4, 5). Without memory the policy reached 4.16%; with an LSTM, 7.31%. Tripling the grid's scan time (163 to 504 s) reduced its error only from 6.86% to 6.04%. Most of the gain survived without adaptation: the distilled protocol reached 3.34% [2.30-4.86] and swapped schedules 3.61% [3.01-4.45]. Adaptation showed in the worst case (5.1% versus 10.3-17.9% for the fixed schedules): the policy's shortest TI tracked the phantom's shortest T1 (r = 0.57), rescuing two spheres of 41 and 46 ms that the distilled protocol missed by up to 74%.</w:t>
+        <w:t xml:space="preserve">Training moved the policy to short TIs paired with short TRs (Fig 3A-C). On held-out phantoms the TI-histogram policy reached 2.93% MAPE, against 6.04% for the log grid and 7.74% for Cramér-Rao (Figs 4, 5A). Without memory the policy reached 4.16%; with an LSTM, 7.31%. With 240 s, an RL policy (4.62%) was already more accurate than both fixed designs at 560 s. Most of the gain survived without adaptation: the distilled protocol reached 3.34% and swapped schedules 3.61%. Adaptation showed in the worst case (5.1% versus 10.3-17.9% for fixed schedules; Fig 5A): the policy rescued two spheres of 41 and 46 ms that the distilled protocol missed by up to 74% (Fig 4). Adaptation mattered more on clustered-T1 scans: swapping schedules cost 2.57 points [95% CI 1.21-4.24], against 0.67 (not significant) on spread T1s, and fixed protocols 8.3-12.2% against the policy's 2.76%, mostly at short T1 (Figs 3D, 5B).</w:t>
       </w:r>
     </w:p>
     <w:p>
@@ -410,7 +410,25 @@
         <w:spacing w:after="120"/>
       </w:pPr>
       <w:r>
-        <w:t xml:space="preserve">Closed-loop RL worked mainly as protocol discovery: the learned schedule acquires more blocks than either comparator (12.5 versus 9-10) by keeping TR short unless TI is long. The Cramér-Rao schedule, optimal for an unbiased estimator's variance, did worst at this noise level and block count. Because each scan's five spheres usually spanned most of the T1 range, one schedule suited most scans; per-scan adaptation paid off only for rare outliers, adding robustness rather than mean accuracy. Limitations: simulation only (ideal RF, no B1, eddy currents or motion), one phantom, five spheres, one seed per arm, 24 held-out scans; the two-sphere effect is post hoc.</w:t>
+        <w:t xml:space="preserve">RL worked mainly as protocol discovery: short TRs, which the fitter's incomplete-recovery model permits, fit more blocks than either comparator. Look-Locker</w:t>
+      </w:r>
+      <w:r>
+        <w:rPr>
+          <w:vertAlign w:val="superscript"/>
+        </w:rPr>
+        <w:t xml:space="preserve">10</w:t>
+      </w:r>
+      <w:r>
+        <w:t xml:space="preserve"> and MR fingerprinting</w:t>
+      </w:r>
+      <w:r>
+        <w:rPr>
+          <w:vertAlign w:val="superscript"/>
+        </w:rPr>
+        <w:t xml:space="preserve">11</w:t>
+      </w:r>
+      <w:r>
+        <w:t xml:space="preserve"> sequences exploit incomplete recovery further; letting RL design them is our next step. Variance-optimal Cramér-Rao design did worst at this noise level. A fixed schedule nearly matched the adaptive policy on average, as each scan's five spheres usually spanned most of the T1 range. Adaptation paid off on rare short-T1 spheres and clustered T1s, so it should matter most when tissue T1 is narrow but unknown. Limitations: simulation only (ideal RF, no B1, eddy currents or motion), one phantom, five spheres, one training seed per policy, one cluster width; the two-sphere effect is post hoc.</w:t>
       </w:r>
     </w:p>
     <w:p>
@@ -522,6 +540,24 @@
     </w:p>
     <w:p>
       <w:pPr>
+        <w:spacing w:after="60"/>
+        <w:ind w:left="360" w:hanging="360"/>
+      </w:pPr>
+      <w:r>
+        <w:t xml:space="preserve">10. Look DC, Locker DR. Time saving in measurement of NMR and EPR relaxation times. Rev Sci Instrum. 1970;41(2):250-251. doi:10.1063/1.1684482</w:t>
+      </w:r>
+    </w:p>
+    <w:p>
+      <w:pPr>
+        <w:spacing w:after="60"/>
+        <w:ind w:left="360" w:hanging="360"/>
+      </w:pPr>
+      <w:r>
+        <w:t xml:space="preserve">11. Ma D, Gulani V, Seiberlich N, et al. Magnetic resonance fingerprinting. Nature. 2013;495(7440):187-192. doi:10.1038/nature11971</w:t>
+      </w:r>
+    </w:p>
+    <w:p>
+      <w:pPr>
         <w:pStyle w:val="Heading1"/>
         <w:keepNext/>
       </w:pPr>
@@ -547,7 +583,7 @@
       <w:r>
         <w:drawing>
           <wp:inline distT="0" distB="0" distL="0" distR="0">
-            <wp:extent cx="5715000" cy="2733675"/>
+            <wp:extent cx="5715000" cy="3324225"/>
             <wp:effectExtent t="0" r="0" b="0" l="0"/>
             <wp:docPr id="1" name=""/>
             <wp:cNvGraphicFramePr>
@@ -572,7 +608,7 @@
                   <pic:spPr bwMode="auto">
                     <a:xfrm>
                       <a:off x="0" y="0"/>
-                      <a:ext cx="5715000" cy="2733675"/>
+                      <a:ext cx="5715000" cy="3324225"/>
                     </a:xfrm>
                     <a:prstGeom prst="rect">
                       <a:avLst/>
@@ -598,7 +634,7 @@
         <w:t xml:space="preserve">Figure 1. </w:t>
       </w:r>
       <w:r>
-        <w:t xml:space="preserve">MRISystemPhantom.jl: open-source digital twin of the ISMRM/NIST system phantom (CaliberMRI QalibreMD Model 130) returning KomaMRI phantoms. (A) Twin at 3 T, spheres coloured by T1 (≥2 s saturates). (B) T1-plate slab of three 1.5 T training phantoms: five spheres redrawn uniformly over 0.024-1.88 s, the other nine positions (dotted) water, pose jittered in-plane. (C) Bloch spins (bars) and cost (line) per RL step; cached water makes a step 3x cheaper than full Bloch. ≈: not timed on CPU.</w:t>
+        <w:t xml:space="preserve">MRISystemPhantom.jl: open-source digital twin of the CaliberMRI QalibreMD Model 130, returning KomaMRI phantoms. (A) 3 T twin, spheres coloured by T1 (≥2 s saturates). (B) Three 1.5 T training phantoms, T1-plate slab: five spheres redrawn uniformly over 0.024-1.88 s, nine water (dotted), in-plane pose jitter. (C) IR-SE shot; the policy sets TI, TR per 32-shot block. (D) Bloch spins (bars), cost (line) per RL step; cached water: 3x cheaper than full Bloch. ≈: untimed, as cached 3 mm (same spins).</w:t>
       </w:r>
     </w:p>
     <w:p>
@@ -611,7 +647,7 @@
           <w:sz w:val="18"/>
           <w:szCs w:val="18"/>
         </w:rPr>
-        <w:t xml:space="preserve">Caption: 491/500 characters</w:t>
+        <w:t xml:space="preserve">Caption: 500/500 characters</w:t>
       </w:r>
     </w:p>
     <w:p>
@@ -717,7 +753,7 @@
       <w:r>
         <w:drawing>
           <wp:inline distT="0" distB="0" distL="0" distR="0">
-            <wp:extent cx="5715000" cy="5676900"/>
+            <wp:extent cx="5715000" cy="5667375"/>
             <wp:effectExtent t="0" r="0" b="0" l="0"/>
             <wp:docPr id="3" name=""/>
             <wp:cNvGraphicFramePr>
@@ -742,7 +778,7 @@
                   <pic:spPr bwMode="auto">
                     <a:xfrm>
                       <a:off x="0" y="0"/>
-                      <a:ext cx="5715000" cy="5676900"/>
+                      <a:ext cx="5715000" cy="5667375"/>
                     </a:xfrm>
                     <a:prstGeom prst="rect">
                       <a:avLst/>
@@ -768,7 +804,7 @@
         <w:t xml:space="preserve">Figure 3. </w:t>
       </w:r>
       <w:r>
-        <w:t xml:space="preserve">TI-histogram policy over training, 24 validation phantoms unless stated. (A) T1 MAPE of every saved checkpoint, full Bloch (mean, bootstrap 95% CI); faint: logged probes; star and lines: selected checkpoint and fixed protocols, 24 held-out phantoms. Coloured: checkpoints followed in B and C. (B) Executed (TI, TR): pairing short TIs with short TRs fits 13 blocks, not 7. (C) T1 MAPE within a scan (median, IQR). (D) Selected policy's TI per block, coloured by mean sphere T1; inset: one IR-SE shot.</w:t>
+        <w:t xml:space="preserve">TI-histogram policy over training, 24 validation phantoms unless stated. (A) T1 MAPE of each saved checkpoint, full Bloch (mean, bootstrap 95% CI); faint: logged probes; star, lines: selected checkpoint, fixed protocols on 24 held-out phantoms. (B) Executed (TI, TR) of coloured checkpoints: pairing short TIs with short TRs fits 13 blocks, not 7. (C) T1 MAPE within a scan (median, IQR); grey: fixed protocols. (D) Selected policy's TIs on spread and clustered-T1 scans, coloured by mean sphere T1.</w:t>
       </w:r>
     </w:p>
     <w:p>
@@ -853,7 +889,7 @@
         <w:t xml:space="preserve">Figure 4. </w:t>
       </w:r>
       <w:r>
-        <w:t xml:space="preserve">T1 maps of the held-out scan with the shortest sphere T1 of the 24 (41 ms), chosen to show where per-scan adaptation matters (representative errors: Fig 5). Rows: TI-histogram policy (adaptive), a fixed protocol distilled from it (shortest TI 243 ms), fixed log TI grid, Cramér-Rao. The policy moved its TIs down to 113 ms and measured the 41 ms sphere to 0.3%; the distilled protocol missed it by 33%. Left: per-pixel T1 fit; right: scored ROI error (3x3-pixel ROI fit) per sphere.</w:t>
+        <w:t xml:space="preserve">T1 maps of the held-out scan with the shortest sphere T1 of the 24 (41 ms), chosen to show where per-scan adaptation matters (representative errors: Fig 5A). Rows: TI-histogram policy (adaptive), a fixed protocol distilled from it (shortest TI 243 ms), fixed log TI grid, Cramér-Rao. The policy moved its TIs down to 113 ms and measured the 41 ms sphere to 0.3%; the distilled protocol missed it by 33%. Left: per-pixel T1 fit; right: scored ROI error (3x3-pixel ROI fit) per sphere.</w:t>
       </w:r>
     </w:p>
     <w:p>
@@ -866,7 +902,7 @@
           <w:sz w:val="18"/>
           <w:szCs w:val="18"/>
         </w:rPr>
-        <w:t xml:space="preserve">Caption: 482/500 characters</w:t>
+        <w:t xml:space="preserve">Caption: 483/500 characters</w:t>
       </w:r>
     </w:p>
     <w:p>
@@ -887,7 +923,7 @@
       <w:r>
         <w:drawing>
           <wp:inline distT="0" distB="0" distL="0" distR="0">
-            <wp:extent cx="5715000" cy="2286000"/>
+            <wp:extent cx="5715000" cy="3409950"/>
             <wp:effectExtent t="0" r="0" b="0" l="0"/>
             <wp:docPr id="5" name=""/>
             <wp:cNvGraphicFramePr>
@@ -912,7 +948,7 @@
                   <pic:spPr bwMode="auto">
                     <a:xfrm>
                       <a:off x="0" y="0"/>
-                      <a:ext cx="5715000" cy="2286000"/>
+                      <a:ext cx="5715000" cy="3409950"/>
                     </a:xfrm>
                     <a:prstGeom prst="rect">
                       <a:avLst/>
@@ -938,7 +974,7 @@
         <w:t xml:space="preserve">Figure 5. </w:t>
       </w:r>
       <w:r>
-        <w:t xml:space="preserve">T1 error on 24 held-out random phantoms, identical for every method and never used for training or checkpoint selection. MAPE: mean absolute percentage error over five spheres, averaged over scans (bootstrap 95% CI); &lt;5%: share of scans under 5%; worst: highest scan MAPE. Fixed grid: log-spaced TIs, TR 1.7 s. Cramér-Rao: schedule optimised for the plate's T1 range. Distilled: per-block median TI and TR of the RL policy. Same T1 fitter throughout. †LSTM checkpoint predates full-Bloch training.</w:t>
+        <w:t xml:space="preserve">T1 error on phantoms identical across methods, unseen in training or checkpoint selection: (A) 24 held-out; (B) 96 clustered-T1 (T1s within ±15% of a random centre). MAPE: mean absolute percentage error over a scan's spheres, averaged over scans (bootstrap 95% CI); worst: highest scan MAPE. Fixed grid: log-spaced TIs, TR 1.7 s. Cramér-Rao: optimised for the plate's T1 range. Distilled: per-block median TI and TR of the policy. Same T1 fitter for all.</w:t>
       </w:r>
     </w:p>
     <w:p>
@@ -951,7 +987,7 @@
           <w:sz w:val="18"/>
           <w:szCs w:val="18"/>
         </w:rPr>
-        <w:t xml:space="preserve">Caption: 497/500 characters</w:t>
+        <w:t xml:space="preserve">Caption: 454/500 characters</w:t>
       </w:r>
     </w:p>
     <w:p>
@@ -1061,7 +1097,7 @@
         </w:numPr>
       </w:pPr>
       <w:r>
-        <w:t xml:space="preserve">Title 114/125 characters; impact 36/40 words; synopsis 99/100 words; body 742/750 words including section headings.</w:t>
+        <w:t xml:space="preserve">Title 111/125 characters; impact 37/40 words; synopsis 98/100 words; body 746/750 words including section headings.</w:t>
       </w:r>
     </w:p>
     <w:p>
@@ -1073,7 +1109,7 @@
         </w:numPr>
       </w:pPr>
       <w:r>
-        <w:t xml:space="preserve">Captions: Figure 1 491, Figure 2 494, Figure 3 499, Figure 4 482, Figure 5 497 (max 500 characters each).</w:t>
+        <w:t xml:space="preserve">Captions: Figure 1 500, Figure 2 494, Figure 3 499, Figure 4 483, Figure 5 454 (max 500 characters each).</w:t>
       </w:r>
     </w:p>
     <w:p>

</xml_diff>

<commit_message>
Switch the log TI grid comparator to the best grid of a TR sweep
The grid TR (1.7 s) came from an early agent on a different task, so a sweep
over TR 0.8-4 s (plus the policy's mean and median TR) replayed the grid on
the held-out phantoms, both as built and with the top TI capped to fit each
TR. The best grid, TR 2.0 s capped (5.12% vs 6.04%), is now the comparator in
Figs 3, 4 and 5 and in the text; fixed_schedules.jl defines it once
(best_log_grid_schedule) and every replay checks it reproduces the sweep.

Text: comparator described as best of a held-out TR sweep, "halved" softened,
grid-search fitter step stated, Look-Locker/MRF references replaced by a
generic next-step sentence, Results and Discussion tightened to 739 words.
</commit_message>
<xml_diff>
--- a/ismrm_latex/vancouver/ISMRM2027_abstract_draft.docx
+++ b/ismrm_latex/vancouver/ISMRM2027_abstract_draft.docx
@@ -134,7 +134,7 @@
         <w:spacing w:after="120"/>
       </w:pPr>
       <w:r>
-        <w:t xml:space="preserve">An open-source, KomaMRI-based digital twin of a calibration phantom lets reinforcement learning design quantitative MRI protocols before scanning. Learned sequences halved T1 error versus standard designs. Adapting mid-scan helps most when tissue T1 is a narrow range.</w:t>
+        <w:t xml:space="preserve">An open-source, KomaMRI-based digital twin of a calibration phantom lets reinforcement learning design quantitative MRI protocols before scanning. Learned sequences nearly halved T1 error versus standard designs. Adapting mid-scan helps most when tissue T1 is a narrow range.</w:t>
       </w:r>
     </w:p>
     <w:p>
@@ -203,7 +203,7 @@
         <w:t xml:space="preserve">Results:</w:t>
       </w:r>
       <w:r>
-        <w:t xml:space="preserve"> On held-out phantoms the policy halved T1 error against log-spaced and Cramér-Rao-optimal schedules (2.9% versus 6.0% and 7.7%). A fixed protocol distilled from the adaptive policy kept most of the gain (3.3%).</w:t>
+        <w:t xml:space="preserve"> On held-out phantoms the policy cut T1 error against log-spaced and Cramér-Rao-optimal schedules (2.9% versus 5.1% and 7.7%). A fixed protocol distilled from the adaptive policy kept most of the gain (3.3%).</w:t>
       </w:r>
     </w:p>
     <w:p>
@@ -298,7 +298,7 @@
         <w:t xml:space="preserve">7</w:t>
       </w:r>
       <w:r>
-        <w:t xml:space="preserve"> phantoms (Fig 1A). Random phantoms with hidden ground truth vary pose, sphere selection, and T1 and T2 from any chosen distribution (Fig 1B). The package also provides inversion-recovery spin-echo (IR-SE) sequences (Fig 1C), complex Gaussian k-space noise, a T1 fitter modelling incomplete recovery and a Cramér-Rao schedule solver. Noise-free simulations recover reference T1 with 0.48% mean error.</w:t>
+        <w:t xml:space="preserve"> phantoms (Fig 1A). Random phantoms with hidden ground truth vary pose, sphere selection, and T1 and T2 from any chosen distribution (Fig 1B). The package also provides inversion-recovery spin-echo (IR-SE) sequences (Fig 1C), complex Gaussian k-space noise, a grid-search T1 fitter (200 values, 2.9% apart) modelling incomplete recovery and a Cramér-Rao schedule solver. Noise-free simulations recover reference T1 with 0.48% mean error.</w:t>
       </w:r>
     </w:p>
     <w:p>
@@ -367,7 +367,7 @@
         <w:t xml:space="preserve">Evaluation.</w:t>
       </w:r>
       <w:r>
-        <w:t xml:space="preserve"> We tested on 24 held-out phantoms from the training distribution and on 96 clustered-T1 phantoms from a new distribution: five T1s within ±15% of a log-uniform centre. Fixed comparators were a log-spaced TI grid (TR 1.7 s) and a Cramér-Rao-optimal (TI, TR) schedule</w:t>
+        <w:t xml:space="preserve"> We tested on 24 held-out phantoms from the training distribution and on 96 clustered-T1 phantoms from a new distribution: five T1s within ±15% of a log-uniform centre. Fixed comparators were a log-spaced TI grid (TR 2.0 s, best of a held-out TR sweep) and a Cramér-Rao-optimal (TI, TR) schedule</w:t>
       </w:r>
       <w:r>
         <w:rPr>
@@ -393,7 +393,7 @@
         <w:spacing w:after="120"/>
       </w:pPr>
       <w:r>
-        <w:t xml:space="preserve">Training moved the policy to short TIs paired with short TRs (Fig 3A-C). On held-out phantoms the TI-histogram policy reached 2.93% MAPE, against 6.04% for the log grid and 7.74% for Cramér-Rao (Figs 4, 5A). Without memory the policy reached 4.16%; with an LSTM, 7.31%. With 240 s, an RL policy (4.62%) was already more accurate than both fixed designs at 560 s. Most of the gain survived without adaptation: the distilled protocol reached 3.34% and swapped schedules 3.61%. Adaptation showed in the worst case (5.1% versus 10.3-17.9% for fixed schedules; Fig 5A): the policy rescued two spheres of 41 and 46 ms that the distilled protocol missed by up to 74% (Fig 4). Adaptation mattered more on clustered-T1 scans: swapping schedules cost 2.57 points [95% CI 1.21-4.24], against 0.67 (not significant) on spread T1s, and fixed protocols 8.3-12.2% against the policy's 2.76%, mostly at short T1 (Figs 3D, 5B).</w:t>
+        <w:t xml:space="preserve">Training moved the policy to short TIs paired with short TRs (Fig 3A-C). On held-out phantoms the TI-histogram policy reached 2.93% MAPE, against 5.12% for the best log grid and 7.74% for Cramér-Rao (Figs 4, 5A). Without memory the policy reached 4.16%; with an LSTM, 7.31%. With 240 s, an RL policy was more accurate (4.62%) than both fixed designs at 560 s. Without adaptation most of the gain survived: distilled 3.34%, swapped schedules 3.61%. Adaptation helped in the worst case (5.1% versus 8.7-17.9%; Fig 5A), rescuing two spheres of 41 and 46 ms that the distilled protocol missed by up to 74% (Fig 4). Adaptation mattered more on clustered-T1 scans: swapping schedules cost 2.57 points [95% CI 1.21-4.24], mostly at short T1, versus 0.67 (not significant) on spread T1s, and fixed protocols reached 8.5-12.2% versus 2.76% (Figs 3D, 5B).</w:t>
       </w:r>
     </w:p>
     <w:p>
@@ -410,25 +410,7 @@
         <w:spacing w:after="120"/>
       </w:pPr>
       <w:r>
-        <w:t xml:space="preserve">RL worked mainly as protocol discovery: short TRs, which the fitter's incomplete-recovery model permits, fit more blocks than either comparator. Look-Locker</w:t>
-      </w:r>
-      <w:r>
-        <w:rPr>
-          <w:vertAlign w:val="superscript"/>
-        </w:rPr>
-        <w:t xml:space="preserve">10</w:t>
-      </w:r>
-      <w:r>
-        <w:t xml:space="preserve"> and MR fingerprinting</w:t>
-      </w:r>
-      <w:r>
-        <w:rPr>
-          <w:vertAlign w:val="superscript"/>
-        </w:rPr>
-        <w:t xml:space="preserve">11</w:t>
-      </w:r>
-      <w:r>
-        <w:t xml:space="preserve"> sequences exploit incomplete recovery further; letting RL design them is our next step. Variance-optimal Cramér-Rao design did worst at this noise level. A fixed schedule nearly matched the adaptive policy on average, as each scan's five spheres usually spanned most of the T1 range. Adaptation paid off on rare short-T1 spheres and clustered T1s, so it should matter most when tissue T1 is narrow but unknown. Limitations: simulation only (ideal RF, no B1, eddy currents or motion), one phantom, five spheres, one training seed per policy, one cluster width; the two-sphere effect is post hoc.</w:t>
+        <w:t xml:space="preserve">RL worked mainly as protocol discovery: short TRs, which the fitter's incomplete-recovery model permits, fit more blocks than either comparator. Sequences acquiring several TIs or k-space lines per inversion exploit this further and are our next target. Variance-optimal Cramér-Rao design did worst at this noise level. A fixed schedule nearly matched the policy because each scan's spheres usually spanned most of the T1 range. Adaptation paid off on rare short-T1 spheres and clustered T1s, so it should matter most when tissue T1 is narrow but unknown. Limitations: simulation only (ideal RF, no B1, eddy currents or motion), one phantom, five spheres, one training seed per policy, one cluster width; the two-sphere effect is post hoc.</w:t>
       </w:r>
     </w:p>
     <w:p>
@@ -445,7 +427,7 @@
         <w:spacing w:after="120"/>
       </w:pPr>
       <w:r>
-        <w:t xml:space="preserve">RL in an open-source digital twin found a T1 protocol halving the error of established fixed designs; distilled, it runs as a conventional sequence, with the adaptive policy safeguarding unusual tissue. Next: validation on the physical phantom and T2 mapping.</w:t>
+        <w:t xml:space="preserve">RL in an open-source digital twin found a T1 protocol that nearly halves fixed-design error and runs as a conventional sequence; adapting each scan protects unusual tissue. Next: validation on the physical phantom and T2 mapping.</w:t>
       </w:r>
     </w:p>
     <w:p>
@@ -536,24 +518,6 @@
       </w:pPr>
       <w:r>
         <w:t xml:space="preserve">9. Jones JA, Hodgkinson P, Barker AL, Hore PJ. Optimal sampling strategies for the measurement of spin-spin relaxation times. J Magn Reson B. 1996;113(1):25-34. doi:10.1006/jmrb.1996.0151</w:t>
-      </w:r>
-    </w:p>
-    <w:p>
-      <w:pPr>
-        <w:spacing w:after="60"/>
-        <w:ind w:left="360" w:hanging="360"/>
-      </w:pPr>
-      <w:r>
-        <w:t xml:space="preserve">10. Look DC, Locker DR. Time saving in measurement of NMR and EPR relaxation times. Rev Sci Instrum. 1970;41(2):250-251. doi:10.1063/1.1684482</w:t>
-      </w:r>
-    </w:p>
-    <w:p>
-      <w:pPr>
-        <w:spacing w:after="60"/>
-        <w:ind w:left="360" w:hanging="360"/>
-      </w:pPr>
-      <w:r>
-        <w:t xml:space="preserve">11. Ma D, Gulani V, Seiberlich N, et al. Magnetic resonance fingerprinting. Nature. 2013;495(7440):187-192. doi:10.1038/nature11971</w:t>
       </w:r>
     </w:p>
     <w:p>
@@ -889,7 +853,7 @@
         <w:t xml:space="preserve">Figure 4. </w:t>
       </w:r>
       <w:r>
-        <w:t xml:space="preserve">T1 maps of the held-out scan with the shortest sphere T1 of the 24 (41 ms), chosen to show where per-scan adaptation matters (representative errors: Fig 5A). Rows: TI-histogram policy (adaptive), a fixed protocol distilled from it (shortest TI 243 ms), fixed log TI grid, Cramér-Rao. The policy moved its TIs down to 113 ms and measured the 41 ms sphere to 0.3%; the distilled protocol missed it by 33%. Left: per-pixel T1 fit; right: scored ROI error (3x3-pixel ROI fit) per sphere.</w:t>
+        <w:t xml:space="preserve">T1 maps of the held-out scan with the shortest sphere T1 of the 24 (41 ms), chosen to show where per-scan adaptation matters (representative errors: Fig 5A). Rows: TI-histogram policy (adaptive), a fixed protocol distilled from it (shortest TI 243 ms), fixed log TI grid (TR 2.0 s), Cramér-Rao. The policy moved its TIs down to 113 ms and measured the 41 ms sphere to 0.3%; the distilled protocol missed it by 33%. Left: per-pixel T1 fit; right: scored ROI error (3x3-pixel ROI fit) per sphere.</w:t>
       </w:r>
     </w:p>
     <w:p>
@@ -902,7 +866,7 @@
           <w:sz w:val="18"/>
           <w:szCs w:val="18"/>
         </w:rPr>
-        <w:t xml:space="preserve">Caption: 483/500 characters</w:t>
+        <w:t xml:space="preserve">Caption: 494/500 characters</w:t>
       </w:r>
     </w:p>
     <w:p>
@@ -974,7 +938,7 @@
         <w:t xml:space="preserve">Figure 5. </w:t>
       </w:r>
       <w:r>
-        <w:t xml:space="preserve">T1 error on phantoms identical across methods, unseen in training or checkpoint selection: (A) 24 held-out; (B) 96 clustered-T1 (T1s within ±15% of a random centre). MAPE: mean absolute percentage error over a scan's spheres, averaged over scans (bootstrap 95% CI); worst: highest scan MAPE. Fixed grid: log-spaced TIs, TR 1.7 s. Cramér-Rao: optimised for the plate's T1 range. Distilled: per-block median TI and TR of the policy. Same T1 fitter for all.</w:t>
+        <w:t xml:space="preserve">T1 error on phantoms identical across methods, unseen in training or checkpoint selection: (A) 24 held-out; (B) 96 clustered-T1 (T1s within ±15% of a random centre). MAPE: mean absolute percentage error over a scan's spheres, averaged over scans (bootstrap 95% CI); worst: highest scan MAPE. Fixed grid: log-spaced TIs, TR 2.0 s (best of a 0.8-4 s sweep), top TI capped to fit. Cramér-Rao: optimised for the plate's T1 range. Distilled: policy's per-block median TI and TR. Same T1 fitter for all.</w:t>
       </w:r>
     </w:p>
     <w:p>
@@ -987,7 +951,7 @@
           <w:sz w:val="18"/>
           <w:szCs w:val="18"/>
         </w:rPr>
-        <w:t xml:space="preserve">Caption: 454/500 characters</w:t>
+        <w:t xml:space="preserve">Caption: 497/500 characters</w:t>
       </w:r>
     </w:p>
     <w:p>
@@ -1097,7 +1061,7 @@
         </w:numPr>
       </w:pPr>
       <w:r>
-        <w:t xml:space="preserve">Title 111/125 characters; impact 37/40 words; synopsis 98/100 words; body 746/750 words including section headings.</w:t>
+        <w:t xml:space="preserve">Title 111/125 characters; impact 38/40 words; synopsis 98/100 words; body 739/750 words including section headings.</w:t>
       </w:r>
     </w:p>
     <w:p>
@@ -1109,7 +1073,7 @@
         </w:numPr>
       </w:pPr>
       <w:r>
-        <w:t xml:space="preserve">Captions: Figure 1 500, Figure 2 494, Figure 3 499, Figure 4 483, Figure 5 454 (max 500 characters each).</w:t>
+        <w:t xml:space="preserve">Captions: Figure 1 500, Figure 2 494, Figure 3 499, Figure 4 494, Figure 5 497 (max 500 characters each).</w:t>
       </w:r>
     </w:p>
     <w:p>

</xml_diff>

<commit_message>
Finalise abstract text at 750 words and add the twin preview figure
Limitations now name the field strength and noise level, known-position ROIs
and the single fitter the policy may exploit; the Conclusion separates the
adaptive policy's gain from the distilled fixed sequence; next steps add
full-resolution T1 maps. The preview pairs a clean render of the twin with
the held-out MAPE of the policy, the best fixed grid and Cramér-Rao
(preview_v2.py, 3:2, under 1 MB).
</commit_message>
<xml_diff>
--- a/ismrm_latex/vancouver/ISMRM2027_abstract_draft.docx
+++ b/ismrm_latex/vancouver/ISMRM2027_abstract_draft.docx
@@ -410,7 +410,7 @@
         <w:spacing w:after="120"/>
       </w:pPr>
       <w:r>
-        <w:t xml:space="preserve">RL worked mainly as protocol discovery: short TRs, which the fitter's incomplete-recovery model permits, fit more blocks than either comparator. Sequences acquiring several TIs or k-space lines per inversion exploit this further and are our next target. Variance-optimal Cramér-Rao design did worst at this noise level. A fixed schedule nearly matched the policy because each scan's spheres usually spanned most of the T1 range. Adaptation paid off on rare short-T1 spheres and clustered T1s, so it should matter most when tissue T1 is narrow but unknown. Limitations: simulation only (ideal RF, no B1, eddy currents or motion), one phantom, five spheres, one training seed per policy, one cluster width; the two-sphere effect is post hoc.</w:t>
+        <w:t xml:space="preserve">RL worked mainly as protocol discovery: short TRs, which the fitter's incomplete-recovery model permits, fit more blocks than either comparator. Sequences acquiring several TIs or k-space lines per inversion exploit this further and are our next target. Variance-optimal Cramér-Rao design did the worst at this noise level. A fixed schedule nearly matched the policy because each scan's spheres usually spanned most of the T1 range. Adaptation paid off on rare short-T1 spheres and clustered T1s, so it should matter most when tissue T1 is narrow but unknown. Limitations: simulation only at one field strength and noise level (ideal RF, no motion), only five sphere ROIs at known positions, one seed per policy, and a single fitter the policy may exploit.</w:t>
       </w:r>
     </w:p>
     <w:p>
@@ -427,7 +427,7 @@
         <w:spacing w:after="120"/>
       </w:pPr>
       <w:r>
-        <w:t xml:space="preserve">RL in an open-source digital twin found a T1 protocol that nearly halves fixed-design error and runs as a conventional sequence; adapting each scan protects unusual tissue. Next: validation on the physical phantom and T2 mapping.</w:t>
+        <w:t xml:space="preserve">In a digital twin, RL learned a T1 policy that nearly halves fixed-design error. Most of the gain survives as a fixed sequence; adaptation adds most when tissue T1 is narrow but unknown. Next: physical-phantom validation, T2 mapping and full-resolution T1 maps.</w:t>
       </w:r>
     </w:p>
     <w:p>
@@ -1061,7 +1061,7 @@
         </w:numPr>
       </w:pPr>
       <w:r>
-        <w:t xml:space="preserve">Title 111/125 characters; impact 38/40 words; synopsis 98/100 words; body 739/750 words including section headings.</w:t>
+        <w:t xml:space="preserve">Title 111/125 characters; impact 38/40 words; synopsis 98/100 words; body 750/750 words including section headings.</w:t>
       </w:r>
     </w:p>
     <w:p>

</xml_diff>